<commit_message>
Chapter 3 person B: final-mode Word output, Table 3.2 as separate file
- tao_word.py: no team note or yellow highlight in the final file
  (TO_VANG flag keeps the draft mode); Table 3.2 for person C now goes
  to ch3_bang_3_2_cho_C.docx.
- kiem_tra_word.py: checks both files and that no highlight or team
  note remains.

Co-Authored-By: Claude Opus 5.5 <noreply@anthropic.com>
Claude-Session: https://claude.ai/code/session_01N5hfqEt1Nergf7js5PTLwW
</commit_message>
<xml_diff>
--- a/nckh_chuong3_B/ch3_3_3_3_5_1_3_5_2.docx
+++ b/nckh_chuong3_B/ch3_3_3_3_5_1_3_5_2.docx
@@ -2,41 +2,6 @@
 <file path=word/document.xml><?xml version="1.0" encoding="utf-8"?>
 <w:document xmlns:wpc="http://schemas.microsoft.com/office/word/2010/wordprocessingCanvas" xmlns:mo="http://schemas.microsoft.com/office/mac/office/2008/main" xmlns:mc="http://schemas.openxmlformats.org/markup-compatibility/2006" xmlns:mv="urn:schemas-microsoft-com:mac:vml" xmlns:o="urn:schemas-microsoft-com:office:office" xmlns:r="http://schemas.openxmlformats.org/officeDocument/2006/relationships" xmlns:m="http://schemas.openxmlformats.org/officeDocument/2006/math" xmlns:v="urn:schemas-microsoft-com:vml" xmlns:wp14="http://schemas.microsoft.com/office/word/2010/wordprocessingDrawing" xmlns:wp="http://schemas.openxmlformats.org/drawingml/2006/wordprocessingDrawing" xmlns:w10="urn:schemas-microsoft-com:office:word" xmlns:w="http://schemas.openxmlformats.org/wordprocessingml/2006/main" xmlns:w14="http://schemas.microsoft.com/office/word/2010/wordml" xmlns:wpg="http://schemas.microsoft.com/office/word/2010/wordprocessingGroup" xmlns:wpi="http://schemas.microsoft.com/office/word/2010/wordprocessingInk" xmlns:wne="http://schemas.microsoft.com/office/word/2006/wordml" xmlns:wps="http://schemas.microsoft.com/office/word/2010/wordprocessingShape" mc:Ignorable="w14 wp14">
   <w:body>
-    <w:p>
-      <w:pPr>
-        <w:jc w:val="both"/>
-      </w:pPr>
-      <w:r>
-        <w:rPr>
-          <w:b/>
-          <w:i/>
-          <w:sz w:val="22"/>
-        </w:rPr>
-        <w:t xml:space="preserve">Ghi chú cho nhóm (xóa đoạn này khi ráp chương): </w:t>
-      </w:r>
-      <w:r>
-        <w:rPr>
-          <w:i/>
-          <w:sz w:val="22"/>
-        </w:rPr>
-        <w:t xml:space="preserve">các chỗ </w:t>
-      </w:r>
-      <w:r>
-        <w:rPr>
-          <w:i/>
-          <w:sz w:val="22"/>
-          <w:highlight w:val="yellow"/>
-        </w:rPr>
-        <w:t>tô vàng</w:t>
-      </w:r>
-      <w:r>
-        <w:rPr>
-          <w:i/>
-          <w:sz w:val="22"/>
-        </w:rPr>
-        <w:t xml:space="preserve"> là số của tệp Original lấy từ kết quả chạy thử trong file kế hoạch, vì notebook hiện tại đọc nhầm tệp. Chạy lại notebook B_3_5_1_3_5_2.ipynb; nếu số in ra giống thì bỏ tô vàng, nếu khác thì sửa theo số in ra. Các số còn lại đã lấy từ lần chạy thật trên tệp chính.</w:t>
-      </w:r>
-    </w:p>
     <w:p>
       <w:pPr>
         <w:pStyle w:val="Heading2"/>
@@ -783,7 +748,6 @@
       <w:r>
         <w:rPr>
           <w:i w:val="0"/>
-          <w:highlight w:val="yellow"/>
         </w:rPr>
         <w:t>Nhóm đã đối chiếu từng cột mã với cột trả lời gốc bằng bảng chéo và thấy mỗi lựa chọn chỉ ứng với một mã.</w:t>
       </w:r>
@@ -1221,7 +1185,6 @@
               <w:rPr>
                 <w:b w:val="0"/>
                 <w:sz w:val="24"/>
-                <w:highlight w:val="yellow"/>
               </w:rPr>
               <w:t>791</w:t>
             </w:r>
@@ -1241,7 +1204,6 @@
               <w:rPr>
                 <w:b w:val="0"/>
                 <w:sz w:val="24"/>
-                <w:highlight w:val="yellow"/>
               </w:rPr>
               <w:t>0</w:t>
             </w:r>
@@ -1261,7 +1223,6 @@
               <w:rPr>
                 <w:b w:val="0"/>
                 <w:sz w:val="24"/>
-                <w:highlight w:val="yellow"/>
               </w:rPr>
               <w:t>0</w:t>
             </w:r>
@@ -1281,7 +1242,6 @@
               <w:rPr>
                 <w:b w:val="0"/>
                 <w:sz w:val="24"/>
-                <w:highlight w:val="yellow"/>
               </w:rPr>
               <w:t>2</w:t>
             </w:r>
@@ -1301,7 +1261,6 @@
               <w:rPr>
                 <w:b w:val="0"/>
                 <w:sz w:val="24"/>
-                <w:highlight w:val="yellow"/>
               </w:rPr>
               <w:t>33</w:t>
             </w:r>
@@ -1321,7 +1280,6 @@
               <w:rPr>
                 <w:b w:val="0"/>
                 <w:sz w:val="24"/>
-                <w:highlight w:val="yellow"/>
               </w:rPr>
               <w:t>183</w:t>
             </w:r>
@@ -1349,7 +1307,6 @@
       <w:r>
         <w:rPr>
           <w:i w:val="0"/>
-          <w:highlight w:val="yellow"/>
         </w:rPr>
         <w:t>Cả hai tệp</w:t>
       </w:r>
@@ -1362,7 +1319,6 @@
       <w:r>
         <w:rPr>
           <w:i w:val="0"/>
-          <w:highlight w:val="yellow"/>
         </w:rPr>
         <w:t>216 dòng</w:t>
       </w:r>
@@ -1375,7 +1331,6 @@
       <w:r>
         <w:rPr>
           <w:i w:val="0"/>
-          <w:highlight w:val="yellow"/>
         </w:rPr>
         <w:t>cả 791 trên 791 dòng của tệp Original đều tìm thấy trong tệp chính</w:t>
       </w:r>
@@ -1388,7 +1343,6 @@
       <w:r>
         <w:rPr>
           <w:i w:val="0"/>
-          <w:highlight w:val="yellow"/>
         </w:rPr>
         <w:t>205</w:t>
       </w:r>
@@ -1413,7 +1367,6 @@
       <w:r>
         <w:rPr>
           <w:i w:val="0"/>
-          <w:highlight w:val="yellow"/>
         </w:rPr>
         <w:t>216</w:t>
       </w:r>
@@ -1426,7 +1379,6 @@
       <w:r>
         <w:rPr>
           <w:i w:val="0"/>
-          <w:highlight w:val="yellow"/>
         </w:rPr>
         <w:t>791</w:t>
       </w:r>
@@ -2360,686 +2312,6 @@
         <w:t>Kết luận: chất lượng giấc ngủ phân bố hai đầu (45,8% tệ, 46,7% tốt). Bốn yếu tố tập trung ở mức cao, ít người ở mức thấp, nên phần so sánh nhóm phải gộp các mức thấp.</w:t>
       </w:r>
     </w:p>
-    <w:p>
-      <w:r>
-        <w:br w:type="page"/>
-      </w:r>
-    </w:p>
-    <w:p>
-      <w:pPr>
-        <w:jc w:val="both"/>
-      </w:pPr>
-      <w:r>
-        <w:rPr>
-          <w:b/>
-          <w:i w:val="0"/>
-        </w:rPr>
-        <w:t>Phần chuyển cho C (mục 3.4): số liệu cho Bảng 3.2</w:t>
-      </w:r>
-    </w:p>
-    <w:p>
-      <w:pPr>
-        <w:jc w:val="both"/>
-      </w:pPr>
-      <w:r>
-        <w:rPr>
-          <w:i/>
-          <w:sz w:val="24"/>
-        </w:rPr>
-        <w:t>Số liệu dưới đây lấy từ cùng lần chạy bảng tần số của mục 3.5.2 (bang_3_5_2.csv). C chép bảng này vào mục 3.4.</w:t>
-      </w:r>
-    </w:p>
-    <w:p>
-      <w:pPr>
-        <w:keepNext/>
-        <w:spacing w:before="120" w:after="80"/>
-        <w:jc w:val="center"/>
-      </w:pPr>
-      <w:r>
-        <w:rPr>
-          <w:b/>
-        </w:rPr>
-        <w:t xml:space="preserve">Bảng 3.2. </w:t>
-      </w:r>
-      <w:r>
-        <w:rPr>
-          <w:b/>
-        </w:rPr>
-        <w:t>Đặc điểm mẫu (n = 996)</w:t>
-      </w:r>
-    </w:p>
-    <w:tbl>
-      <w:tblPr>
-        <w:tblStyle w:val="TableGrid"/>
-        <w:tblW w:type="auto" w:w="0"/>
-        <w:jc w:val="center"/>
-        <w:tblLayout w:type="fixed"/>
-        <w:tblLook w:firstColumn="1" w:firstRow="1" w:lastColumn="0" w:lastRow="0" w:noHBand="0" w:noVBand="1" w:val="04A0"/>
-        <w:tblLayout w:type="fixed"/>
-      </w:tblPr>
-      <w:tblGrid>
-        <w:gridCol w:w="1984"/>
-        <w:gridCol w:w="1984"/>
-        <w:gridCol w:w="1701"/>
-        <w:gridCol w:w="1701"/>
-      </w:tblGrid>
-      <w:tr>
-        <w:trPr>
-          <w:cantSplit/>
-          <w:tblHeader/>
-        </w:trPr>
-        <w:tc>
-          <w:tcPr>
-            <w:tcW w:type="dxa" w:w="1984"/>
-          </w:tcPr>
-          <w:p>
-            <w:pPr>
-              <w:keepNext/>
-              <w:spacing w:line="240" w:lineRule="auto" w:after="40" w:before="40"/>
-              <w:ind w:firstLine="0"/>
-              <w:jc w:val="center"/>
-            </w:pPr>
-            <w:r>
-              <w:rPr>
-                <w:b/>
-                <w:sz w:val="24"/>
-              </w:rPr>
-              <w:t>Đặc điểm</w:t>
-            </w:r>
-          </w:p>
-        </w:tc>
-        <w:tc>
-          <w:tcPr>
-            <w:tcW w:type="dxa" w:w="1984"/>
-          </w:tcPr>
-          <w:p>
-            <w:pPr>
-              <w:keepNext/>
-              <w:spacing w:line="240" w:lineRule="auto" w:after="40" w:before="40"/>
-              <w:ind w:firstLine="0"/>
-              <w:jc w:val="center"/>
-            </w:pPr>
-            <w:r>
-              <w:rPr>
-                <w:b/>
-                <w:sz w:val="24"/>
-              </w:rPr>
-              <w:t>Nhóm</w:t>
-            </w:r>
-          </w:p>
-        </w:tc>
-        <w:tc>
-          <w:tcPr>
-            <w:tcW w:type="dxa" w:w="1701"/>
-          </w:tcPr>
-          <w:p>
-            <w:pPr>
-              <w:keepNext/>
-              <w:spacing w:line="240" w:lineRule="auto" w:after="40" w:before="40"/>
-              <w:ind w:firstLine="0"/>
-              <w:jc w:val="center"/>
-            </w:pPr>
-            <w:r>
-              <w:rPr>
-                <w:b/>
-                <w:sz w:val="24"/>
-              </w:rPr>
-              <w:t>Số lượng</w:t>
-            </w:r>
-          </w:p>
-        </w:tc>
-        <w:tc>
-          <w:tcPr>
-            <w:tcW w:type="dxa" w:w="1701"/>
-          </w:tcPr>
-          <w:p>
-            <w:pPr>
-              <w:keepNext/>
-              <w:spacing w:line="240" w:lineRule="auto" w:after="40" w:before="40"/>
-              <w:ind w:firstLine="0"/>
-              <w:jc w:val="center"/>
-            </w:pPr>
-            <w:r>
-              <w:rPr>
-                <w:b/>
-                <w:sz w:val="24"/>
-              </w:rPr>
-              <w:t>Tỉ lệ (%)</w:t>
-            </w:r>
-          </w:p>
-        </w:tc>
-      </w:tr>
-      <w:tr>
-        <w:trPr>
-          <w:cantSplit/>
-        </w:trPr>
-        <w:tc>
-          <w:tcPr>
-            <w:tcW w:type="dxa" w:w="1984"/>
-          </w:tcPr>
-          <w:p>
-            <w:pPr>
-              <w:keepNext/>
-              <w:spacing w:line="240" w:lineRule="auto" w:after="40" w:before="40"/>
-              <w:ind w:firstLine="0"/>
-              <w:jc w:val="left"/>
-            </w:pPr>
-            <w:r>
-              <w:rPr>
-                <w:b w:val="0"/>
-                <w:sz w:val="24"/>
-              </w:rPr>
-              <w:t>Giới tính</w:t>
-            </w:r>
-          </w:p>
-        </w:tc>
-        <w:tc>
-          <w:tcPr>
-            <w:tcW w:type="dxa" w:w="1984"/>
-          </w:tcPr>
-          <w:p>
-            <w:pPr>
-              <w:keepNext/>
-              <w:spacing w:line="240" w:lineRule="auto" w:after="40" w:before="40"/>
-              <w:ind w:firstLine="0"/>
-              <w:jc w:val="left"/>
-            </w:pPr>
-            <w:r>
-              <w:rPr>
-                <w:b w:val="0"/>
-                <w:sz w:val="24"/>
-              </w:rPr>
-              <w:t>Nam</w:t>
-            </w:r>
-          </w:p>
-        </w:tc>
-        <w:tc>
-          <w:tcPr>
-            <w:tcW w:type="dxa" w:w="1701"/>
-          </w:tcPr>
-          <w:p>
-            <w:pPr>
-              <w:keepNext/>
-              <w:spacing w:line="240" w:lineRule="auto" w:after="40" w:before="40"/>
-              <w:ind w:firstLine="0"/>
-              <w:jc w:val="center"/>
-            </w:pPr>
-            <w:r>
-              <w:rPr>
-                <w:b w:val="0"/>
-                <w:sz w:val="24"/>
-              </w:rPr>
-              <w:t>691</w:t>
-            </w:r>
-          </w:p>
-        </w:tc>
-        <w:tc>
-          <w:tcPr>
-            <w:tcW w:type="dxa" w:w="1701"/>
-          </w:tcPr>
-          <w:p>
-            <w:pPr>
-              <w:keepNext/>
-              <w:spacing w:line="240" w:lineRule="auto" w:after="40" w:before="40"/>
-              <w:ind w:firstLine="0"/>
-              <w:jc w:val="center"/>
-            </w:pPr>
-            <w:r>
-              <w:rPr>
-                <w:b w:val="0"/>
-                <w:sz w:val="24"/>
-              </w:rPr>
-              <w:t>69,4</w:t>
-            </w:r>
-          </w:p>
-        </w:tc>
-      </w:tr>
-      <w:tr>
-        <w:trPr>
-          <w:cantSplit/>
-        </w:trPr>
-        <w:tc>
-          <w:tcPr>
-            <w:tcW w:type="dxa" w:w="1984"/>
-          </w:tcPr>
-          <w:p>
-            <w:pPr>
-              <w:keepNext/>
-              <w:spacing w:line="240" w:lineRule="auto" w:after="40" w:before="40"/>
-              <w:ind w:firstLine="0"/>
-              <w:jc w:val="left"/>
-            </w:pPr>
-            <w:r>
-              <w:rPr>
-                <w:b w:val="0"/>
-                <w:sz w:val="24"/>
-              </w:rPr>
-              <w:t>Giới tính</w:t>
-            </w:r>
-          </w:p>
-        </w:tc>
-        <w:tc>
-          <w:tcPr>
-            <w:tcW w:type="dxa" w:w="1984"/>
-          </w:tcPr>
-          <w:p>
-            <w:pPr>
-              <w:keepNext/>
-              <w:spacing w:line="240" w:lineRule="auto" w:after="40" w:before="40"/>
-              <w:ind w:firstLine="0"/>
-              <w:jc w:val="left"/>
-            </w:pPr>
-            <w:r>
-              <w:rPr>
-                <w:b w:val="0"/>
-                <w:sz w:val="24"/>
-              </w:rPr>
-              <w:t>Nữ</w:t>
-            </w:r>
-          </w:p>
-        </w:tc>
-        <w:tc>
-          <w:tcPr>
-            <w:tcW w:type="dxa" w:w="1701"/>
-          </w:tcPr>
-          <w:p>
-            <w:pPr>
-              <w:keepNext/>
-              <w:spacing w:line="240" w:lineRule="auto" w:after="40" w:before="40"/>
-              <w:ind w:firstLine="0"/>
-              <w:jc w:val="center"/>
-            </w:pPr>
-            <w:r>
-              <w:rPr>
-                <w:b w:val="0"/>
-                <w:sz w:val="24"/>
-              </w:rPr>
-              <w:t>305</w:t>
-            </w:r>
-          </w:p>
-        </w:tc>
-        <w:tc>
-          <w:tcPr>
-            <w:tcW w:type="dxa" w:w="1701"/>
-          </w:tcPr>
-          <w:p>
-            <w:pPr>
-              <w:keepNext/>
-              <w:spacing w:line="240" w:lineRule="auto" w:after="40" w:before="40"/>
-              <w:ind w:firstLine="0"/>
-              <w:jc w:val="center"/>
-            </w:pPr>
-            <w:r>
-              <w:rPr>
-                <w:b w:val="0"/>
-                <w:sz w:val="24"/>
-              </w:rPr>
-              <w:t>30,6</w:t>
-            </w:r>
-          </w:p>
-        </w:tc>
-      </w:tr>
-      <w:tr>
-        <w:trPr>
-          <w:cantSplit/>
-        </w:trPr>
-        <w:tc>
-          <w:tcPr>
-            <w:tcW w:type="dxa" w:w="1984"/>
-          </w:tcPr>
-          <w:p>
-            <w:pPr>
-              <w:keepNext/>
-              <w:spacing w:line="240" w:lineRule="auto" w:after="40" w:before="40"/>
-              <w:ind w:firstLine="0"/>
-              <w:jc w:val="left"/>
-            </w:pPr>
-            <w:r>
-              <w:rPr>
-                <w:b w:val="0"/>
-                <w:sz w:val="24"/>
-              </w:rPr>
-              <w:t>Năm học</w:t>
-            </w:r>
-          </w:p>
-        </w:tc>
-        <w:tc>
-          <w:tcPr>
-            <w:tcW w:type="dxa" w:w="1984"/>
-          </w:tcPr>
-          <w:p>
-            <w:pPr>
-              <w:keepNext/>
-              <w:spacing w:line="240" w:lineRule="auto" w:after="40" w:before="40"/>
-              <w:ind w:firstLine="0"/>
-              <w:jc w:val="left"/>
-            </w:pPr>
-            <w:r>
-              <w:rPr>
-                <w:b w:val="0"/>
-                <w:sz w:val="24"/>
-              </w:rPr>
-              <w:t>Năm 1</w:t>
-            </w:r>
-          </w:p>
-        </w:tc>
-        <w:tc>
-          <w:tcPr>
-            <w:tcW w:type="dxa" w:w="1701"/>
-          </w:tcPr>
-          <w:p>
-            <w:pPr>
-              <w:keepNext/>
-              <w:spacing w:line="240" w:lineRule="auto" w:after="40" w:before="40"/>
-              <w:ind w:firstLine="0"/>
-              <w:jc w:val="center"/>
-            </w:pPr>
-            <w:r>
-              <w:rPr>
-                <w:b w:val="0"/>
-                <w:sz w:val="24"/>
-              </w:rPr>
-              <w:t>22</w:t>
-            </w:r>
-          </w:p>
-        </w:tc>
-        <w:tc>
-          <w:tcPr>
-            <w:tcW w:type="dxa" w:w="1701"/>
-          </w:tcPr>
-          <w:p>
-            <w:pPr>
-              <w:keepNext/>
-              <w:spacing w:line="240" w:lineRule="auto" w:after="40" w:before="40"/>
-              <w:ind w:firstLine="0"/>
-              <w:jc w:val="center"/>
-            </w:pPr>
-            <w:r>
-              <w:rPr>
-                <w:b w:val="0"/>
-                <w:sz w:val="24"/>
-              </w:rPr>
-              <w:t>2,2</w:t>
-            </w:r>
-          </w:p>
-        </w:tc>
-      </w:tr>
-      <w:tr>
-        <w:trPr>
-          <w:cantSplit/>
-        </w:trPr>
-        <w:tc>
-          <w:tcPr>
-            <w:tcW w:type="dxa" w:w="1984"/>
-          </w:tcPr>
-          <w:p>
-            <w:pPr>
-              <w:keepNext/>
-              <w:spacing w:line="240" w:lineRule="auto" w:after="40" w:before="40"/>
-              <w:ind w:firstLine="0"/>
-              <w:jc w:val="left"/>
-            </w:pPr>
-            <w:r>
-              <w:rPr>
-                <w:b w:val="0"/>
-                <w:sz w:val="24"/>
-              </w:rPr>
-              <w:t>Năm học</w:t>
-            </w:r>
-          </w:p>
-        </w:tc>
-        <w:tc>
-          <w:tcPr>
-            <w:tcW w:type="dxa" w:w="1984"/>
-          </w:tcPr>
-          <w:p>
-            <w:pPr>
-              <w:keepNext/>
-              <w:spacing w:line="240" w:lineRule="auto" w:after="40" w:before="40"/>
-              <w:ind w:firstLine="0"/>
-              <w:jc w:val="left"/>
-            </w:pPr>
-            <w:r>
-              <w:rPr>
-                <w:b w:val="0"/>
-                <w:sz w:val="24"/>
-              </w:rPr>
-              <w:t>Năm 2</w:t>
-            </w:r>
-          </w:p>
-        </w:tc>
-        <w:tc>
-          <w:tcPr>
-            <w:tcW w:type="dxa" w:w="1701"/>
-          </w:tcPr>
-          <w:p>
-            <w:pPr>
-              <w:keepNext/>
-              <w:spacing w:line="240" w:lineRule="auto" w:after="40" w:before="40"/>
-              <w:ind w:firstLine="0"/>
-              <w:jc w:val="center"/>
-            </w:pPr>
-            <w:r>
-              <w:rPr>
-                <w:b w:val="0"/>
-                <w:sz w:val="24"/>
-              </w:rPr>
-              <w:t>74</w:t>
-            </w:r>
-          </w:p>
-        </w:tc>
-        <w:tc>
-          <w:tcPr>
-            <w:tcW w:type="dxa" w:w="1701"/>
-          </w:tcPr>
-          <w:p>
-            <w:pPr>
-              <w:keepNext/>
-              <w:spacing w:line="240" w:lineRule="auto" w:after="40" w:before="40"/>
-              <w:ind w:firstLine="0"/>
-              <w:jc w:val="center"/>
-            </w:pPr>
-            <w:r>
-              <w:rPr>
-                <w:b w:val="0"/>
-                <w:sz w:val="24"/>
-              </w:rPr>
-              <w:t>7,4</w:t>
-            </w:r>
-          </w:p>
-        </w:tc>
-      </w:tr>
-      <w:tr>
-        <w:trPr>
-          <w:cantSplit/>
-        </w:trPr>
-        <w:tc>
-          <w:tcPr>
-            <w:tcW w:type="dxa" w:w="1984"/>
-          </w:tcPr>
-          <w:p>
-            <w:pPr>
-              <w:keepNext/>
-              <w:spacing w:line="240" w:lineRule="auto" w:after="40" w:before="40"/>
-              <w:ind w:firstLine="0"/>
-              <w:jc w:val="left"/>
-            </w:pPr>
-            <w:r>
-              <w:rPr>
-                <w:b w:val="0"/>
-                <w:sz w:val="24"/>
-              </w:rPr>
-              <w:t>Năm học</w:t>
-            </w:r>
-          </w:p>
-        </w:tc>
-        <w:tc>
-          <w:tcPr>
-            <w:tcW w:type="dxa" w:w="1984"/>
-          </w:tcPr>
-          <w:p>
-            <w:pPr>
-              <w:keepNext/>
-              <w:spacing w:line="240" w:lineRule="auto" w:after="40" w:before="40"/>
-              <w:ind w:firstLine="0"/>
-              <w:jc w:val="left"/>
-            </w:pPr>
-            <w:r>
-              <w:rPr>
-                <w:b w:val="0"/>
-                <w:sz w:val="24"/>
-              </w:rPr>
-              <w:t>Năm 3</w:t>
-            </w:r>
-          </w:p>
-        </w:tc>
-        <w:tc>
-          <w:tcPr>
-            <w:tcW w:type="dxa" w:w="1701"/>
-          </w:tcPr>
-          <w:p>
-            <w:pPr>
-              <w:keepNext/>
-              <w:spacing w:line="240" w:lineRule="auto" w:after="40" w:before="40"/>
-              <w:ind w:firstLine="0"/>
-              <w:jc w:val="center"/>
-            </w:pPr>
-            <w:r>
-              <w:rPr>
-                <w:b w:val="0"/>
-                <w:sz w:val="24"/>
-              </w:rPr>
-              <w:t>419</w:t>
-            </w:r>
-          </w:p>
-        </w:tc>
-        <w:tc>
-          <w:tcPr>
-            <w:tcW w:type="dxa" w:w="1701"/>
-          </w:tcPr>
-          <w:p>
-            <w:pPr>
-              <w:keepNext/>
-              <w:spacing w:line="240" w:lineRule="auto" w:after="40" w:before="40"/>
-              <w:ind w:firstLine="0"/>
-              <w:jc w:val="center"/>
-            </w:pPr>
-            <w:r>
-              <w:rPr>
-                <w:b w:val="0"/>
-                <w:sz w:val="24"/>
-              </w:rPr>
-              <w:t>42,1</w:t>
-            </w:r>
-          </w:p>
-        </w:tc>
-      </w:tr>
-      <w:tr>
-        <w:trPr>
-          <w:cantSplit/>
-        </w:trPr>
-        <w:tc>
-          <w:tcPr>
-            <w:tcW w:type="dxa" w:w="1984"/>
-          </w:tcPr>
-          <w:p>
-            <w:pPr>
-              <w:spacing w:line="240" w:lineRule="auto" w:after="40" w:before="40"/>
-              <w:ind w:firstLine="0"/>
-              <w:jc w:val="left"/>
-            </w:pPr>
-            <w:r>
-              <w:rPr>
-                <w:b w:val="0"/>
-                <w:sz w:val="24"/>
-              </w:rPr>
-              <w:t>Năm học</w:t>
-            </w:r>
-          </w:p>
-        </w:tc>
-        <w:tc>
-          <w:tcPr>
-            <w:tcW w:type="dxa" w:w="1984"/>
-          </w:tcPr>
-          <w:p>
-            <w:pPr>
-              <w:spacing w:line="240" w:lineRule="auto" w:after="40" w:before="40"/>
-              <w:ind w:firstLine="0"/>
-              <w:jc w:val="left"/>
-            </w:pPr>
-            <w:r>
-              <w:rPr>
-                <w:b w:val="0"/>
-                <w:sz w:val="24"/>
-              </w:rPr>
-              <w:t>Sau đại học</w:t>
-            </w:r>
-          </w:p>
-        </w:tc>
-        <w:tc>
-          <w:tcPr>
-            <w:tcW w:type="dxa" w:w="1701"/>
-          </w:tcPr>
-          <w:p>
-            <w:pPr>
-              <w:spacing w:line="240" w:lineRule="auto" w:after="40" w:before="40"/>
-              <w:ind w:firstLine="0"/>
-              <w:jc w:val="center"/>
-            </w:pPr>
-            <w:r>
-              <w:rPr>
-                <w:b w:val="0"/>
-                <w:sz w:val="24"/>
-              </w:rPr>
-              <w:t>481</w:t>
-            </w:r>
-          </w:p>
-        </w:tc>
-        <w:tc>
-          <w:tcPr>
-            <w:tcW w:type="dxa" w:w="1701"/>
-          </w:tcPr>
-          <w:p>
-            <w:pPr>
-              <w:spacing w:line="240" w:lineRule="auto" w:after="40" w:before="40"/>
-              <w:ind w:firstLine="0"/>
-              <w:jc w:val="center"/>
-            </w:pPr>
-            <w:r>
-              <w:rPr>
-                <w:b w:val="0"/>
-                <w:sz w:val="24"/>
-              </w:rPr>
-              <w:t>48,3</w:t>
-            </w:r>
-          </w:p>
-        </w:tc>
-      </w:tr>
-    </w:tbl>
-    <w:p>
-      <w:pPr>
-        <w:spacing w:before="40" w:after="200" w:line="240" w:lineRule="auto"/>
-      </w:pPr>
-      <w:r>
-        <w:rPr>
-          <w:i/>
-          <w:sz w:val="22"/>
-        </w:rPr>
-        <w:t>Nguồn: Kết quả chạy trên Google Colab (bang_3_5_2.csv).</w:t>
-      </w:r>
-    </w:p>
-    <w:p>
-      <w:pPr>
-        <w:jc w:val="both"/>
-      </w:pPr>
-      <w:r>
-        <w:rPr>
-          <w:i/>
-          <w:sz w:val="24"/>
-        </w:rPr>
-        <w:t>Lưu ý cho C: năm 1 chỉ có 22 người nên không so sánh riêng theo năm học.</w:t>
-      </w:r>
-    </w:p>
     <w:sectPr>
       <w:pgSz w:w="11906" w:h="16838"/>
       <w:pgMar w:top="1134" w:right="1134" w:bottom="1134" w:left="1701" w:header="720" w:footer="720" w:gutter="0"/>

</xml_diff>

<commit_message>
Chapter 3 person B: single final Word file with text fixes
- Table 3.2 for person C moved back into the main file (last page);
  separate ch3_bang_3_2_cho_C.docx removed.
- Text fixes: drop unsupported claims (questionnaire format of all 15
  items, "two to five options per item", unrun cross-tab check, replaced
  by the verified 1-5 / 1-4 code ranges); describe linear models as used
  in 3.5.5-3.5.7; clearer MD5 and file-merge sentences.
- Guide updated for the single final file.

Co-Authored-By: Claude Opus 5.5 <noreply@anthropic.com>
Claude-Session: https://claude.ai/code/session_01N5hfqEt1Nergf7js5PTLwW
</commit_message>
<xml_diff>
--- a/nckh_chuong3_B/ch3_3_3_3_5_1_3_5_2.docx
+++ b/nckh_chuong3_B/ch3_3_3_3_5_1_3_5_2.docx
@@ -19,7 +19,7 @@
         <w:rPr>
           <w:i w:val="0"/>
         </w:rPr>
-        <w:t>Nghiên cứu dùng dữ liệu thứ cấp nên nhóm không tự thiết kế bảng hỏi. Thang đo được mô tả trong mục này là bảng hỏi của tác giả bộ dữ liệu (Abdullah &amp; Rahman, phiên bản 3, Mendeley Data), gồm 15 câu trắc nghiệm ký hiệu từ Q1 đến Q15. Ở mỗi câu, người trả lời chọn một phương án trong danh sách có sẵn. Nhóm giữ nguyên nội dung câu hỏi và cách trả lời, chỉ chọn ra những câu phù hợp với câu hỏi nghiên cứu và mô tả lại cách mã hóa.</w:t>
+        <w:t>Nghiên cứu dùng dữ liệu thứ cấp nên nhóm không tự thiết kế bảng hỏi. Thang đo được mô tả trong mục này là bảng hỏi của tác giả bộ dữ liệu (Abdullah &amp; Rahman, phiên bản 3, Mendeley Data), gồm 15 câu, ký hiệu từ Q1 đến Q15. Nhóm giữ nguyên nội dung câu hỏi và cách trả lời, chỉ chọn ra những câu phù hợp với câu hỏi nghiên cứu và mô tả lại cách mã hóa.</w:t>
       </w:r>
     </w:p>
     <w:p>
@@ -31,7 +31,7 @@
         <w:rPr>
           <w:i w:val="0"/>
         </w:rPr>
-        <w:t>Trong 15 câu, nhóm dùng 7 câu. Câu Q6 đo chất lượng giấc ngủ và là biến phụ thuộc. Bốn câu Q11, Q12, Q13 và Q14 đo bốn yếu tố được xem xét: sử dụng thiết bị trước giờ ngủ, tiêu thụ caffeine, hoạt động thể chất và căng thẳng học tập. Hai câu Q1 (năm học) và Q2 (giới tính) được dùng làm biến kiểm soát. Mỗi câu được chọn ứng với đúng một biến trong khung nghiên cứu ở mục 3.2. Bảng 3.1 trình bày câu hỏi, các lựa chọn trả lời, mã số và tên cột tương ứng trong tệp dữ liệu.</w:t>
+        <w:t>Trong 15 câu, nhóm dùng 7 câu. Cả bảy câu đều là câu hỏi đóng: người trả lời chọn một phương án trong danh sách có sẵn. Câu Q6 đo chất lượng giấc ngủ và là biến phụ thuộc. Bốn câu Q11, Q12, Q13 và Q14 đo bốn yếu tố được xem xét: sử dụng thiết bị trước giờ ngủ, tiêu thụ caffeine, hoạt động thể chất và căng thẳng học tập. Hai câu Q1 (năm học) và Q2 (giới tính) được dùng làm biến kiểm soát. Mỗi câu được chọn ứng với đúng một biến trong khung nghiên cứu ở mục 3.2. Bảng 3.1 trình bày câu hỏi, các lựa chọn trả lời, mã số và tên cột tương ứng trong tệp dữ liệu.</w:t>
       </w:r>
     </w:p>
     <w:p>
@@ -743,13 +743,7 @@
         <w:rPr>
           <w:i w:val="0"/>
         </w:rPr>
-        <w:t xml:space="preserve">Các lựa chọn trả lời được đổi thành số theo thứ tự từ thấp đến cao: từ 1 đến 5 với Q6, Q11, Q12 và Q13; từ 1 đến 4 với Q14, vì câu này chỉ có bốn lựa chọn. Với bốn yếu tố, số càng cao nghĩa là việc đó diễn ra càng thường xuyên hoặc mức căng thẳng càng cao; riêng với Q6, số càng cao nghĩa là ngủ càng tốt. Mã số có sẵn trong các cột có đuôi _ordinal của tệp dữ liệu. </w:t>
-      </w:r>
-      <w:r>
-        <w:rPr>
-          <w:i w:val="0"/>
-        </w:rPr>
-        <w:t>Nhóm đã đối chiếu từng cột mã với cột trả lời gốc bằng bảng chéo và thấy mỗi lựa chọn chỉ ứng với một mã.</w:t>
+        <w:t>Trong tệp dữ liệu, các lựa chọn trả lời đã được mã hóa thành số theo thứ tự từ thấp đến cao: từ 1 đến 5 với Q6, Q11, Q12 và Q13; từ 1 đến 4 với Q14, vì câu này chỉ có bốn lựa chọn. Với bốn yếu tố, số càng cao nghĩa là việc đó diễn ra càng thường xuyên hoặc mức căng thẳng càng cao; riêng với Q6, số càng cao nghĩa là ngủ càng tốt. Mã số nằm trong các cột có đuôi _ordinal. Khi kiểm tra, mỗi cột này chỉ nhận các giá trị từ 1 đến 5 (từ 1 đến 4 với căng thẳng học tập), đúng bằng số lựa chọn của câu tương ứng.</w:t>
       </w:r>
     </w:p>
     <w:p>
@@ -761,7 +755,7 @@
         <w:rPr>
           <w:i w:val="0"/>
         </w:rPr>
-        <w:t>Các mã số này chỉ thể hiện thứ tự, không thể hiện khoảng cách. Chẳng hạn, khoảng cách giữa “Không bao giờ” và “1–2 lần/tuần” không nhất thiết bằng khoảng cách giữa “5–6 lần/tuần” và “Mỗi đêm”; ở Q14 cũng không có lựa chọn trung gian giữa “Thấp” và “Cao”. Vì vậy, nhóm xem các biến này là thang thứ bậc, không xem là thang khoảng cách đều. Các phép phân tích chính dùng phương pháp dành cho dữ liệu thứ bậc: hệ số Spearman (mục 3.5.3), kiểm định Kruskal–Wallis (mục 3.5.4) và hồi quy logit thứ bậc (mục 3.5.5). Mô hình tuyến tính chỉ dùng để so sánh độ lớn giữa các yếu tố ở mục 3.5.5 và 3.5.6; khi đó, việc dùng mã 1–5 như một điểm số là giả định đơn giản hóa.</w:t>
+        <w:t>Các mã số này chỉ thể hiện thứ tự, không thể hiện khoảng cách. Chẳng hạn, khoảng cách giữa “Không bao giờ” và “1–2 lần/tuần” không nhất thiết bằng khoảng cách giữa “5–6 lần/tuần” và “Mỗi đêm”; ở Q14 cũng không có lựa chọn trung gian giữa “Thấp” và “Cao”. Vì vậy, nhóm xem các biến này là thang thứ bậc, không xem là thang khoảng cách đều. Các phép phân tích chính dùng phương pháp dành cho dữ liệu thứ bậc: hệ số Spearman (mục 3.5.3), kiểm định Kruskal–Wallis (mục 3.5.4) và hồi quy logit thứ bậc (mục 3.5.5). Hồi quy tuyến tính chỉ được dùng bổ sung, để so sánh độ lớn liên hệ giữa các yếu tố (mục 3.5.5 và 3.5.6) và kiểm tra độ vững (mục 3.5.7); khi đó, việc dùng mã số như một điểm số là giả định đơn giản hóa.</w:t>
       </w:r>
     </w:p>
     <w:p>
@@ -785,7 +779,7 @@
         <w:rPr>
           <w:i w:val="0"/>
         </w:rPr>
-        <w:t>Tám câu còn lại không được dùng làm biến. Ba câu Q3 (khó vào giấc), Q4 (thời lượng ngủ) và Q5 (thức giấc ban đêm) mô tả chính các biểu hiện của giấc ngủ, tức là gần với nội dung của biến phụ thuộc; nếu đưa chúng vào làm yếu tố thì mối liên hệ với chất lượng giấc ngủ sẽ cao một cách hiển nhiên và không trả lời được câu hỏi nghiên cứu. Năm câu Q7 (khó tập trung), Q8 (mệt mỏi ban ngày), Q9 (vắng học), Q10 (việc hoàn thành bài tập) và Q15 (kết quả học tập) mô tả những gì có thể là hệ quả của giấc ngủ kém. Các câu này đứng sau giấc ngủ trong chuỗi giải thích, nên không phù hợp để làm yếu tố đứng trước chất lượng giấc ngủ.</w:t>
+        <w:t>Tám câu còn lại không được dùng làm biến. Ba câu Q3 (khó vào giấc), Q4 (thời lượng ngủ) và Q5 (thức giấc ban đêm) mô tả chính các biểu hiện của giấc ngủ, tức là gần với nội dung của biến phụ thuộc; nếu đưa chúng vào làm yếu tố thì liên hệ với chất lượng giấc ngủ dễ cao chỉ vì cùng đo giấc ngủ, và không trả lời được câu hỏi nghiên cứu. Năm câu Q7 (khó tập trung), Q8 (mệt mỏi ban ngày), Q9 (vắng học), Q10 (việc hoàn thành bài tập) và Q15 (kết quả học tập) mô tả những gì có thể là hệ quả của giấc ngủ kém. Các câu này đứng sau giấc ngủ trong chuỗi giải thích, nên không phù hợp để làm yếu tố đứng trước chất lượng giấc ngủ.</w:t>
       </w:r>
     </w:p>
     <w:p>
@@ -817,7 +811,7 @@
         <w:rPr>
           <w:i w:val="0"/>
         </w:rPr>
-        <w:t>Trước khi phân tích, nhóm kiểm tra dữ liệu ở bốn điểm: số ô thiếu, số dòng trùng hoàn toàn, số dòng bị gắn cờ nghi vấn và quan hệ giữa hai tệp dữ liệu. Ba loại cờ là các cột có sẵn trong tệp dữ liệu, đánh dấu những phiếu trùng mốc thời gian nộp (flag_repeated_timestamp), có đáp án giống hệt (flag_identical_answers) hoặc gần trùng với phiếu khác (flag_near_duplicate). Để kiểm tra quan hệ giữa hai tệp, mỗi dòng được chuyển thành một mã băm MD5 tạo từ 15 cột trả lời gốc; sau đó nhóm tìm mã của từng dòng trong tệp Original trong tập mã của tệp chính. Các bước này được chạy bằng pandas và hashlib trên Google Colab. Đây là bước mô tả, không có kiểm định thống kê. Kết quả được trình bày ở Bảng 3.3.</w:t>
+        <w:t>Trước khi phân tích, nhóm kiểm tra dữ liệu ở bốn điểm: số ô thiếu, số dòng trùng hoàn toàn, số dòng bị gắn cờ nghi vấn và quan hệ giữa hai tệp dữ liệu. Ba loại cờ là các cột có sẵn trong tệp dữ liệu, đánh dấu những phiếu trùng mốc thời gian nộp (flag_repeated_timestamp), có đáp án giống hệt (flag_identical_answers) hoặc gần trùng với phiếu khác (flag_near_duplicate). Để kiểm tra quan hệ giữa hai tệp, mỗi dòng được chuyển thành một mã băm MD5 tạo từ 15 cột trả lời gốc; sau đó kiểm tra mã của từng dòng trong tệp Original có xuất hiện trong tập mã của tệp chính hay không. Các bước này được chạy bằng pandas và hashlib trên Google Colab. Đây là bước mô tả, không có kiểm định thống kê. Kết quả được trình bày ở Bảng 3.3.</w:t>
       </w:r>
     </w:p>
     <w:p>
@@ -1326,7 +1320,7 @@
         <w:rPr>
           <w:i w:val="0"/>
         </w:rPr>
-        <w:t xml:space="preserve"> bị gắn ít nhất một cờ. Cờ chỉ đánh dấu dòng đáng nghi, chưa chắc là phiếu sai: hai sinh viên vẫn có thể nộp phiếu cùng lúc, hoặc chọn các phương án giống nhau vì mỗi câu chỉ có từ hai đến năm lựa chọn. Vì vậy, nhóm giữ nguyên các dòng bị gắn cờ trong phân tích chính và chạy lại mô hình sau khi loại từng nhóm dòng này ở mục 3.5.7 để xem kết luận có thay đổi hay không. Về quan hệ giữa hai tệp, </w:t>
+        <w:t xml:space="preserve"> bị gắn ít nhất một cờ. Cờ chỉ đánh dấu dòng đáng nghi, chưa chắc là phiếu sai: hai sinh viên vẫn có thể nộp phiếu cùng lúc, hoặc chọn các phương án giống nhau vì mỗi câu chỉ có ít lựa chọn. Vì vậy, nhóm giữ nguyên các dòng bị gắn cờ trong phân tích chính và chạy lại mô hình sau khi loại từng nhóm dòng này ở mục 3.5.7 để xem kết luận có thay đổi hay không. Về quan hệ giữa hai tệp, </w:t>
       </w:r>
       <w:r>
         <w:rPr>
@@ -1338,7 +1332,7 @@
         <w:rPr>
           <w:i w:val="0"/>
         </w:rPr>
-        <w:t xml:space="preserve">, khớp với cột present_in_original (791 dòng được đánh dấu). Tệp chính chỉ có thêm </w:t>
+        <w:t xml:space="preserve">, khớp với cột present_in_original (791 dòng được đánh dấu). Tệp chính có thêm </w:t>
       </w:r>
       <w:r>
         <w:rPr>
@@ -1350,7 +1344,7 @@
         <w:rPr>
           <w:i w:val="0"/>
         </w:rPr>
-        <w:t xml:space="preserve"> dòng so với tệp Original. Do hai tệp không độc lập với nhau, nhóm không gộp chúng lại, vì gộp sẽ đếm trùng 791 quan sát; tệp Original chỉ được dùng để kiểm tra độ vững ở mục 3.5.7.</w:t>
+        <w:t xml:space="preserve"> dòng so với tệp Original. Hai tệp không độc lập với nhau nên nhóm không gộp chúng lại; nếu gộp, 791 quan sát sẽ bị đếm hai lần. Tệp Original chỉ được dùng để kiểm tra độ vững ở mục 3.5.7.</w:t>
       </w:r>
     </w:p>
     <w:p>
@@ -2312,6 +2306,684 @@
         <w:t>Kết luận: chất lượng giấc ngủ phân bố hai đầu (45,8% tệ, 46,7% tốt). Bốn yếu tố tập trung ở mức cao, ít người ở mức thấp, nên phần so sánh nhóm phải gộp các mức thấp.</w:t>
       </w:r>
     </w:p>
+    <w:p>
+      <w:r>
+        <w:br w:type="page"/>
+      </w:r>
+    </w:p>
+    <w:p>
+      <w:pPr>
+        <w:jc w:val="both"/>
+      </w:pPr>
+      <w:r>
+        <w:rPr>
+          <w:b/>
+          <w:i w:val="0"/>
+        </w:rPr>
+        <w:t>Số liệu cho Bảng 3.2 (đặt ở mục 3.4)</w:t>
+      </w:r>
+    </w:p>
+    <w:p>
+      <w:pPr>
+        <w:jc w:val="both"/>
+      </w:pPr>
+      <w:r>
+        <w:rPr>
+          <w:i w:val="0"/>
+        </w:rPr>
+        <w:t>Số liệu dưới đây lấy từ cùng lần chạy bảng tần số của mục 3.5.2 (bang_3_5_2.csv) và được đặt ở mục 3.4.</w:t>
+      </w:r>
+    </w:p>
+    <w:p>
+      <w:pPr>
+        <w:keepNext/>
+        <w:spacing w:before="120" w:after="80"/>
+        <w:jc w:val="center"/>
+      </w:pPr>
+      <w:r>
+        <w:rPr>
+          <w:b/>
+        </w:rPr>
+        <w:t xml:space="preserve">Bảng 3.2. </w:t>
+      </w:r>
+      <w:r>
+        <w:rPr>
+          <w:b/>
+        </w:rPr>
+        <w:t>Đặc điểm mẫu (n = 996)</w:t>
+      </w:r>
+    </w:p>
+    <w:tbl>
+      <w:tblPr>
+        <w:tblStyle w:val="TableGrid"/>
+        <w:tblW w:type="auto" w:w="0"/>
+        <w:jc w:val="center"/>
+        <w:tblLayout w:type="fixed"/>
+        <w:tblLook w:firstColumn="1" w:firstRow="1" w:lastColumn="0" w:lastRow="0" w:noHBand="0" w:noVBand="1" w:val="04A0"/>
+        <w:tblLayout w:type="fixed"/>
+      </w:tblPr>
+      <w:tblGrid>
+        <w:gridCol w:w="1984"/>
+        <w:gridCol w:w="1984"/>
+        <w:gridCol w:w="1701"/>
+        <w:gridCol w:w="1701"/>
+      </w:tblGrid>
+      <w:tr>
+        <w:trPr>
+          <w:cantSplit/>
+          <w:tblHeader/>
+        </w:trPr>
+        <w:tc>
+          <w:tcPr>
+            <w:tcW w:type="dxa" w:w="1984"/>
+          </w:tcPr>
+          <w:p>
+            <w:pPr>
+              <w:keepNext/>
+              <w:spacing w:line="240" w:lineRule="auto" w:after="40" w:before="40"/>
+              <w:ind w:firstLine="0"/>
+              <w:jc w:val="center"/>
+            </w:pPr>
+            <w:r>
+              <w:rPr>
+                <w:b/>
+                <w:sz w:val="24"/>
+              </w:rPr>
+              <w:t>Đặc điểm</w:t>
+            </w:r>
+          </w:p>
+        </w:tc>
+        <w:tc>
+          <w:tcPr>
+            <w:tcW w:type="dxa" w:w="1984"/>
+          </w:tcPr>
+          <w:p>
+            <w:pPr>
+              <w:keepNext/>
+              <w:spacing w:line="240" w:lineRule="auto" w:after="40" w:before="40"/>
+              <w:ind w:firstLine="0"/>
+              <w:jc w:val="center"/>
+            </w:pPr>
+            <w:r>
+              <w:rPr>
+                <w:b/>
+                <w:sz w:val="24"/>
+              </w:rPr>
+              <w:t>Nhóm</w:t>
+            </w:r>
+          </w:p>
+        </w:tc>
+        <w:tc>
+          <w:tcPr>
+            <w:tcW w:type="dxa" w:w="1701"/>
+          </w:tcPr>
+          <w:p>
+            <w:pPr>
+              <w:keepNext/>
+              <w:spacing w:line="240" w:lineRule="auto" w:after="40" w:before="40"/>
+              <w:ind w:firstLine="0"/>
+              <w:jc w:val="center"/>
+            </w:pPr>
+            <w:r>
+              <w:rPr>
+                <w:b/>
+                <w:sz w:val="24"/>
+              </w:rPr>
+              <w:t>Số lượng</w:t>
+            </w:r>
+          </w:p>
+        </w:tc>
+        <w:tc>
+          <w:tcPr>
+            <w:tcW w:type="dxa" w:w="1701"/>
+          </w:tcPr>
+          <w:p>
+            <w:pPr>
+              <w:keepNext/>
+              <w:spacing w:line="240" w:lineRule="auto" w:after="40" w:before="40"/>
+              <w:ind w:firstLine="0"/>
+              <w:jc w:val="center"/>
+            </w:pPr>
+            <w:r>
+              <w:rPr>
+                <w:b/>
+                <w:sz w:val="24"/>
+              </w:rPr>
+              <w:t>Tỉ lệ (%)</w:t>
+            </w:r>
+          </w:p>
+        </w:tc>
+      </w:tr>
+      <w:tr>
+        <w:trPr>
+          <w:cantSplit/>
+        </w:trPr>
+        <w:tc>
+          <w:tcPr>
+            <w:tcW w:type="dxa" w:w="1984"/>
+          </w:tcPr>
+          <w:p>
+            <w:pPr>
+              <w:keepNext/>
+              <w:spacing w:line="240" w:lineRule="auto" w:after="40" w:before="40"/>
+              <w:ind w:firstLine="0"/>
+              <w:jc w:val="left"/>
+            </w:pPr>
+            <w:r>
+              <w:rPr>
+                <w:b w:val="0"/>
+                <w:sz w:val="24"/>
+              </w:rPr>
+              <w:t>Giới tính</w:t>
+            </w:r>
+          </w:p>
+        </w:tc>
+        <w:tc>
+          <w:tcPr>
+            <w:tcW w:type="dxa" w:w="1984"/>
+          </w:tcPr>
+          <w:p>
+            <w:pPr>
+              <w:keepNext/>
+              <w:spacing w:line="240" w:lineRule="auto" w:after="40" w:before="40"/>
+              <w:ind w:firstLine="0"/>
+              <w:jc w:val="left"/>
+            </w:pPr>
+            <w:r>
+              <w:rPr>
+                <w:b w:val="0"/>
+                <w:sz w:val="24"/>
+              </w:rPr>
+              <w:t>Nam</w:t>
+            </w:r>
+          </w:p>
+        </w:tc>
+        <w:tc>
+          <w:tcPr>
+            <w:tcW w:type="dxa" w:w="1701"/>
+          </w:tcPr>
+          <w:p>
+            <w:pPr>
+              <w:keepNext/>
+              <w:spacing w:line="240" w:lineRule="auto" w:after="40" w:before="40"/>
+              <w:ind w:firstLine="0"/>
+              <w:jc w:val="center"/>
+            </w:pPr>
+            <w:r>
+              <w:rPr>
+                <w:b w:val="0"/>
+                <w:sz w:val="24"/>
+              </w:rPr>
+              <w:t>691</w:t>
+            </w:r>
+          </w:p>
+        </w:tc>
+        <w:tc>
+          <w:tcPr>
+            <w:tcW w:type="dxa" w:w="1701"/>
+          </w:tcPr>
+          <w:p>
+            <w:pPr>
+              <w:keepNext/>
+              <w:spacing w:line="240" w:lineRule="auto" w:after="40" w:before="40"/>
+              <w:ind w:firstLine="0"/>
+              <w:jc w:val="center"/>
+            </w:pPr>
+            <w:r>
+              <w:rPr>
+                <w:b w:val="0"/>
+                <w:sz w:val="24"/>
+              </w:rPr>
+              <w:t>69,4</w:t>
+            </w:r>
+          </w:p>
+        </w:tc>
+      </w:tr>
+      <w:tr>
+        <w:trPr>
+          <w:cantSplit/>
+        </w:trPr>
+        <w:tc>
+          <w:tcPr>
+            <w:tcW w:type="dxa" w:w="1984"/>
+          </w:tcPr>
+          <w:p>
+            <w:pPr>
+              <w:keepNext/>
+              <w:spacing w:line="240" w:lineRule="auto" w:after="40" w:before="40"/>
+              <w:ind w:firstLine="0"/>
+              <w:jc w:val="left"/>
+            </w:pPr>
+            <w:r>
+              <w:rPr>
+                <w:b w:val="0"/>
+                <w:sz w:val="24"/>
+              </w:rPr>
+              <w:t>Giới tính</w:t>
+            </w:r>
+          </w:p>
+        </w:tc>
+        <w:tc>
+          <w:tcPr>
+            <w:tcW w:type="dxa" w:w="1984"/>
+          </w:tcPr>
+          <w:p>
+            <w:pPr>
+              <w:keepNext/>
+              <w:spacing w:line="240" w:lineRule="auto" w:after="40" w:before="40"/>
+              <w:ind w:firstLine="0"/>
+              <w:jc w:val="left"/>
+            </w:pPr>
+            <w:r>
+              <w:rPr>
+                <w:b w:val="0"/>
+                <w:sz w:val="24"/>
+              </w:rPr>
+              <w:t>Nữ</w:t>
+            </w:r>
+          </w:p>
+        </w:tc>
+        <w:tc>
+          <w:tcPr>
+            <w:tcW w:type="dxa" w:w="1701"/>
+          </w:tcPr>
+          <w:p>
+            <w:pPr>
+              <w:keepNext/>
+              <w:spacing w:line="240" w:lineRule="auto" w:after="40" w:before="40"/>
+              <w:ind w:firstLine="0"/>
+              <w:jc w:val="center"/>
+            </w:pPr>
+            <w:r>
+              <w:rPr>
+                <w:b w:val="0"/>
+                <w:sz w:val="24"/>
+              </w:rPr>
+              <w:t>305</w:t>
+            </w:r>
+          </w:p>
+        </w:tc>
+        <w:tc>
+          <w:tcPr>
+            <w:tcW w:type="dxa" w:w="1701"/>
+          </w:tcPr>
+          <w:p>
+            <w:pPr>
+              <w:keepNext/>
+              <w:spacing w:line="240" w:lineRule="auto" w:after="40" w:before="40"/>
+              <w:ind w:firstLine="0"/>
+              <w:jc w:val="center"/>
+            </w:pPr>
+            <w:r>
+              <w:rPr>
+                <w:b w:val="0"/>
+                <w:sz w:val="24"/>
+              </w:rPr>
+              <w:t>30,6</w:t>
+            </w:r>
+          </w:p>
+        </w:tc>
+      </w:tr>
+      <w:tr>
+        <w:trPr>
+          <w:cantSplit/>
+        </w:trPr>
+        <w:tc>
+          <w:tcPr>
+            <w:tcW w:type="dxa" w:w="1984"/>
+          </w:tcPr>
+          <w:p>
+            <w:pPr>
+              <w:keepNext/>
+              <w:spacing w:line="240" w:lineRule="auto" w:after="40" w:before="40"/>
+              <w:ind w:firstLine="0"/>
+              <w:jc w:val="left"/>
+            </w:pPr>
+            <w:r>
+              <w:rPr>
+                <w:b w:val="0"/>
+                <w:sz w:val="24"/>
+              </w:rPr>
+              <w:t>Năm học</w:t>
+            </w:r>
+          </w:p>
+        </w:tc>
+        <w:tc>
+          <w:tcPr>
+            <w:tcW w:type="dxa" w:w="1984"/>
+          </w:tcPr>
+          <w:p>
+            <w:pPr>
+              <w:keepNext/>
+              <w:spacing w:line="240" w:lineRule="auto" w:after="40" w:before="40"/>
+              <w:ind w:firstLine="0"/>
+              <w:jc w:val="left"/>
+            </w:pPr>
+            <w:r>
+              <w:rPr>
+                <w:b w:val="0"/>
+                <w:sz w:val="24"/>
+              </w:rPr>
+              <w:t>Năm 1</w:t>
+            </w:r>
+          </w:p>
+        </w:tc>
+        <w:tc>
+          <w:tcPr>
+            <w:tcW w:type="dxa" w:w="1701"/>
+          </w:tcPr>
+          <w:p>
+            <w:pPr>
+              <w:keepNext/>
+              <w:spacing w:line="240" w:lineRule="auto" w:after="40" w:before="40"/>
+              <w:ind w:firstLine="0"/>
+              <w:jc w:val="center"/>
+            </w:pPr>
+            <w:r>
+              <w:rPr>
+                <w:b w:val="0"/>
+                <w:sz w:val="24"/>
+              </w:rPr>
+              <w:t>22</w:t>
+            </w:r>
+          </w:p>
+        </w:tc>
+        <w:tc>
+          <w:tcPr>
+            <w:tcW w:type="dxa" w:w="1701"/>
+          </w:tcPr>
+          <w:p>
+            <w:pPr>
+              <w:keepNext/>
+              <w:spacing w:line="240" w:lineRule="auto" w:after="40" w:before="40"/>
+              <w:ind w:firstLine="0"/>
+              <w:jc w:val="center"/>
+            </w:pPr>
+            <w:r>
+              <w:rPr>
+                <w:b w:val="0"/>
+                <w:sz w:val="24"/>
+              </w:rPr>
+              <w:t>2,2</w:t>
+            </w:r>
+          </w:p>
+        </w:tc>
+      </w:tr>
+      <w:tr>
+        <w:trPr>
+          <w:cantSplit/>
+        </w:trPr>
+        <w:tc>
+          <w:tcPr>
+            <w:tcW w:type="dxa" w:w="1984"/>
+          </w:tcPr>
+          <w:p>
+            <w:pPr>
+              <w:keepNext/>
+              <w:spacing w:line="240" w:lineRule="auto" w:after="40" w:before="40"/>
+              <w:ind w:firstLine="0"/>
+              <w:jc w:val="left"/>
+            </w:pPr>
+            <w:r>
+              <w:rPr>
+                <w:b w:val="0"/>
+                <w:sz w:val="24"/>
+              </w:rPr>
+              <w:t>Năm học</w:t>
+            </w:r>
+          </w:p>
+        </w:tc>
+        <w:tc>
+          <w:tcPr>
+            <w:tcW w:type="dxa" w:w="1984"/>
+          </w:tcPr>
+          <w:p>
+            <w:pPr>
+              <w:keepNext/>
+              <w:spacing w:line="240" w:lineRule="auto" w:after="40" w:before="40"/>
+              <w:ind w:firstLine="0"/>
+              <w:jc w:val="left"/>
+            </w:pPr>
+            <w:r>
+              <w:rPr>
+                <w:b w:val="0"/>
+                <w:sz w:val="24"/>
+              </w:rPr>
+              <w:t>Năm 2</w:t>
+            </w:r>
+          </w:p>
+        </w:tc>
+        <w:tc>
+          <w:tcPr>
+            <w:tcW w:type="dxa" w:w="1701"/>
+          </w:tcPr>
+          <w:p>
+            <w:pPr>
+              <w:keepNext/>
+              <w:spacing w:line="240" w:lineRule="auto" w:after="40" w:before="40"/>
+              <w:ind w:firstLine="0"/>
+              <w:jc w:val="center"/>
+            </w:pPr>
+            <w:r>
+              <w:rPr>
+                <w:b w:val="0"/>
+                <w:sz w:val="24"/>
+              </w:rPr>
+              <w:t>74</w:t>
+            </w:r>
+          </w:p>
+        </w:tc>
+        <w:tc>
+          <w:tcPr>
+            <w:tcW w:type="dxa" w:w="1701"/>
+          </w:tcPr>
+          <w:p>
+            <w:pPr>
+              <w:keepNext/>
+              <w:spacing w:line="240" w:lineRule="auto" w:after="40" w:before="40"/>
+              <w:ind w:firstLine="0"/>
+              <w:jc w:val="center"/>
+            </w:pPr>
+            <w:r>
+              <w:rPr>
+                <w:b w:val="0"/>
+                <w:sz w:val="24"/>
+              </w:rPr>
+              <w:t>7,4</w:t>
+            </w:r>
+          </w:p>
+        </w:tc>
+      </w:tr>
+      <w:tr>
+        <w:trPr>
+          <w:cantSplit/>
+        </w:trPr>
+        <w:tc>
+          <w:tcPr>
+            <w:tcW w:type="dxa" w:w="1984"/>
+          </w:tcPr>
+          <w:p>
+            <w:pPr>
+              <w:keepNext/>
+              <w:spacing w:line="240" w:lineRule="auto" w:after="40" w:before="40"/>
+              <w:ind w:firstLine="0"/>
+              <w:jc w:val="left"/>
+            </w:pPr>
+            <w:r>
+              <w:rPr>
+                <w:b w:val="0"/>
+                <w:sz w:val="24"/>
+              </w:rPr>
+              <w:t>Năm học</w:t>
+            </w:r>
+          </w:p>
+        </w:tc>
+        <w:tc>
+          <w:tcPr>
+            <w:tcW w:type="dxa" w:w="1984"/>
+          </w:tcPr>
+          <w:p>
+            <w:pPr>
+              <w:keepNext/>
+              <w:spacing w:line="240" w:lineRule="auto" w:after="40" w:before="40"/>
+              <w:ind w:firstLine="0"/>
+              <w:jc w:val="left"/>
+            </w:pPr>
+            <w:r>
+              <w:rPr>
+                <w:b w:val="0"/>
+                <w:sz w:val="24"/>
+              </w:rPr>
+              <w:t>Năm 3</w:t>
+            </w:r>
+          </w:p>
+        </w:tc>
+        <w:tc>
+          <w:tcPr>
+            <w:tcW w:type="dxa" w:w="1701"/>
+          </w:tcPr>
+          <w:p>
+            <w:pPr>
+              <w:keepNext/>
+              <w:spacing w:line="240" w:lineRule="auto" w:after="40" w:before="40"/>
+              <w:ind w:firstLine="0"/>
+              <w:jc w:val="center"/>
+            </w:pPr>
+            <w:r>
+              <w:rPr>
+                <w:b w:val="0"/>
+                <w:sz w:val="24"/>
+              </w:rPr>
+              <w:t>419</w:t>
+            </w:r>
+          </w:p>
+        </w:tc>
+        <w:tc>
+          <w:tcPr>
+            <w:tcW w:type="dxa" w:w="1701"/>
+          </w:tcPr>
+          <w:p>
+            <w:pPr>
+              <w:keepNext/>
+              <w:spacing w:line="240" w:lineRule="auto" w:after="40" w:before="40"/>
+              <w:ind w:firstLine="0"/>
+              <w:jc w:val="center"/>
+            </w:pPr>
+            <w:r>
+              <w:rPr>
+                <w:b w:val="0"/>
+                <w:sz w:val="24"/>
+              </w:rPr>
+              <w:t>42,1</w:t>
+            </w:r>
+          </w:p>
+        </w:tc>
+      </w:tr>
+      <w:tr>
+        <w:trPr>
+          <w:cantSplit/>
+        </w:trPr>
+        <w:tc>
+          <w:tcPr>
+            <w:tcW w:type="dxa" w:w="1984"/>
+          </w:tcPr>
+          <w:p>
+            <w:pPr>
+              <w:spacing w:line="240" w:lineRule="auto" w:after="40" w:before="40"/>
+              <w:ind w:firstLine="0"/>
+              <w:jc w:val="left"/>
+            </w:pPr>
+            <w:r>
+              <w:rPr>
+                <w:b w:val="0"/>
+                <w:sz w:val="24"/>
+              </w:rPr>
+              <w:t>Năm học</w:t>
+            </w:r>
+          </w:p>
+        </w:tc>
+        <w:tc>
+          <w:tcPr>
+            <w:tcW w:type="dxa" w:w="1984"/>
+          </w:tcPr>
+          <w:p>
+            <w:pPr>
+              <w:spacing w:line="240" w:lineRule="auto" w:after="40" w:before="40"/>
+              <w:ind w:firstLine="0"/>
+              <w:jc w:val="left"/>
+            </w:pPr>
+            <w:r>
+              <w:rPr>
+                <w:b w:val="0"/>
+                <w:sz w:val="24"/>
+              </w:rPr>
+              <w:t>Sau đại học</w:t>
+            </w:r>
+          </w:p>
+        </w:tc>
+        <w:tc>
+          <w:tcPr>
+            <w:tcW w:type="dxa" w:w="1701"/>
+          </w:tcPr>
+          <w:p>
+            <w:pPr>
+              <w:spacing w:line="240" w:lineRule="auto" w:after="40" w:before="40"/>
+              <w:ind w:firstLine="0"/>
+              <w:jc w:val="center"/>
+            </w:pPr>
+            <w:r>
+              <w:rPr>
+                <w:b w:val="0"/>
+                <w:sz w:val="24"/>
+              </w:rPr>
+              <w:t>481</w:t>
+            </w:r>
+          </w:p>
+        </w:tc>
+        <w:tc>
+          <w:tcPr>
+            <w:tcW w:type="dxa" w:w="1701"/>
+          </w:tcPr>
+          <w:p>
+            <w:pPr>
+              <w:spacing w:line="240" w:lineRule="auto" w:after="40" w:before="40"/>
+              <w:ind w:firstLine="0"/>
+              <w:jc w:val="center"/>
+            </w:pPr>
+            <w:r>
+              <w:rPr>
+                <w:b w:val="0"/>
+                <w:sz w:val="24"/>
+              </w:rPr>
+              <w:t>48,3</w:t>
+            </w:r>
+          </w:p>
+        </w:tc>
+      </w:tr>
+    </w:tbl>
+    <w:p>
+      <w:pPr>
+        <w:spacing w:before="40" w:after="200" w:line="240" w:lineRule="auto"/>
+      </w:pPr>
+      <w:r>
+        <w:rPr>
+          <w:i/>
+          <w:sz w:val="22"/>
+        </w:rPr>
+        <w:t>Nguồn: Kết quả chạy trên Google Colab (bang_3_5_2.csv).</w:t>
+      </w:r>
+    </w:p>
+    <w:p>
+      <w:pPr>
+        <w:jc w:val="both"/>
+      </w:pPr>
+      <w:r>
+        <w:rPr>
+          <w:i w:val="0"/>
+        </w:rPr>
+        <w:t>Năm 1 chỉ có 22 người nên không so sánh riêng theo năm học.</w:t>
+      </w:r>
+    </w:p>
     <w:sectPr>
       <w:pgSz w:w="11906" w:h="16838"/>
       <w:pgMar w:top="1134" w:right="1134" w:bottom="1134" w:left="1701" w:header="720" w:footer="720" w:gutter="0"/>

</xml_diff>